<commit_message>
version final avec filtrage de commandes annulées
</commit_message>
<xml_diff>
--- a/install/Guide OrderSync.docx
+++ b/install/Guide OrderSync.docx
@@ -4837,27 +4837,36 @@
       <w:pPr>
         <w:pStyle w:val="Heading2"/>
       </w:pPr>
-      <w:bookmarkStart w:id="9" w:name="_Toc241166138"/>
-      <w:r>
-        <w:t>Paramétrage de l'environnement</w:t>
-      </w:r>
-      <w:bookmarkEnd w:id="9"/>
+      <w:r>
+        <w:t xml:space="preserve">Installation du pilot OLEDB pour </w:t>
+      </w:r>
+      <w:proofErr w:type="spellStart"/>
+      <w:r>
+        <w:t>Hyperfile</w:t>
+      </w:r>
+      <w:proofErr w:type="spellEnd"/>
     </w:p>
     <w:p>
       <w:pPr>
         <w:pStyle w:val="ListParagraph"/>
-        <w:numPr>
-          <w:ilvl w:val="0"/>
-          <w:numId w:val="11"/>
-        </w:numPr>
-        <w:rPr>
-          <w:i/>
-          <w:iCs/>
-          <w:color w:val="808080" w:themeColor="background1" w:themeShade="80"/>
-        </w:rPr>
-      </w:pPr>
-      <w:r>
-        <w:t xml:space="preserve">Fichier </w:t>
+        <w:jc w:val="both"/>
+        <w:rPr>
+          <w:b/>
+          <w:bCs/>
+        </w:rPr>
+      </w:pPr>
+      <w:r>
+        <w:t xml:space="preserve">Installez le pilot </w:t>
+      </w:r>
+      <w:r>
+        <w:rPr>
+          <w:b/>
+          <w:bCs/>
+        </w:rPr>
+        <w:t>OLEDB25PACKUS090f.exe</w:t>
+      </w:r>
+      <w:r>
+        <w:t xml:space="preserve"> que vous trouverez dans </w:t>
       </w:r>
       <w:proofErr w:type="spellStart"/>
       <w:r>
@@ -4873,7 +4882,7 @@
           <w:b/>
           <w:bCs/>
         </w:rPr>
-        <w:t>\config\</w:t>
+        <w:t>\</w:t>
       </w:r>
       <w:proofErr w:type="spellStart"/>
       <w:r>
@@ -4881,774 +4890,21 @@
           <w:b/>
           <w:bCs/>
         </w:rPr>
-        <w:t>config.yaml</w:t>
+        <w:t>install</w:t>
       </w:r>
       <w:proofErr w:type="spellEnd"/>
-      <w:r>
-        <w:rPr>
-          <w:b/>
-          <w:bCs/>
-        </w:rPr>
-        <w:t>.</w:t>
-      </w:r>
-      <w:r>
-        <w:t xml:space="preserve"> Ce fichier </w:t>
-      </w:r>
-      <w:r>
-        <w:t>contient</w:t>
-      </w:r>
-      <w:r>
-        <w:t xml:space="preserve"> les principaux paramètres de </w:t>
-      </w:r>
-      <w:r>
-        <w:t>l’installation</w:t>
-      </w:r>
-      <w:r>
-        <w:t xml:space="preserve">. Il faudra l’éditer conformément à l’installation de </w:t>
-      </w:r>
-      <w:proofErr w:type="spellStart"/>
-      <w:r>
-        <w:t>winparf</w:t>
-      </w:r>
-      <w:proofErr w:type="spellEnd"/>
-      <w:r>
-        <w:rPr>
-          <w:color w:val="808080" w:themeColor="background1" w:themeShade="80"/>
-        </w:rPr>
-        <w:t>.</w:t>
-      </w:r>
-      <w:r>
-        <w:rPr>
-          <w:i/>
-          <w:iCs/>
-          <w:color w:val="808080" w:themeColor="background1" w:themeShade="80"/>
-        </w:rPr>
-        <w:t xml:space="preserve"> YAML est un langage qui </w:t>
-      </w:r>
-      <w:r>
-        <w:rPr>
-          <w:i/>
-          <w:iCs/>
-          <w:color w:val="808080" w:themeColor="background1" w:themeShade="80"/>
-        </w:rPr>
-        <w:t>défini</w:t>
-      </w:r>
-      <w:r>
-        <w:rPr>
-          <w:i/>
-          <w:iCs/>
-          <w:color w:val="808080" w:themeColor="background1" w:themeShade="80"/>
-        </w:rPr>
-        <w:t>t</w:t>
-      </w:r>
-      <w:r>
-        <w:rPr>
-          <w:i/>
-          <w:iCs/>
-          <w:color w:val="808080" w:themeColor="background1" w:themeShade="80"/>
-        </w:rPr>
-        <w:t xml:space="preserve"> les niveaux par indentation (un numéro de caractères blanc</w:t>
-      </w:r>
-      <w:r>
-        <w:rPr>
-          <w:i/>
-          <w:iCs/>
-          <w:color w:val="808080" w:themeColor="background1" w:themeShade="80"/>
-        </w:rPr>
-        <w:t>s</w:t>
-      </w:r>
-      <w:r>
-        <w:rPr>
-          <w:i/>
-          <w:iCs/>
-          <w:color w:val="808080" w:themeColor="background1" w:themeShade="80"/>
-        </w:rPr>
-        <w:t xml:space="preserve"> égal partout).</w:t>
-      </w:r>
-      <w:r>
-        <w:rPr>
-          <w:i/>
-          <w:iCs/>
-          <w:color w:val="808080" w:themeColor="background1" w:themeShade="80"/>
-        </w:rPr>
-        <w:t xml:space="preserve"> Le caractère # est pour commenter les lignes</w:t>
-      </w:r>
-    </w:p>
-    <w:p>
-      <w:pPr>
-        <w:spacing w:after="0"/>
-        <w:ind w:left="1134"/>
-        <w:rPr>
-          <w:color w:val="00B050"/>
-          <w:lang w:val="en-GB"/>
-        </w:rPr>
-      </w:pPr>
-      <w:r>
-        <w:rPr>
-          <w:color w:val="00B050"/>
-          <w:lang w:val="en-GB"/>
-        </w:rPr>
-        <w:t xml:space="preserve"># YAML file </w:t>
-      </w:r>
-      <w:proofErr w:type="gramStart"/>
-      <w:r>
-        <w:rPr>
-          <w:color w:val="00B050"/>
-          <w:lang w:val="en-GB"/>
-        </w:rPr>
-        <w:t>location :</w:t>
-      </w:r>
-      <w:proofErr w:type="gramEnd"/>
-      <w:r>
-        <w:rPr>
-          <w:color w:val="00B050"/>
-          <w:lang w:val="en-GB"/>
-        </w:rPr>
-        <w:t xml:space="preserve"> config/</w:t>
-      </w:r>
-    </w:p>
-    <w:p>
-      <w:pPr>
-        <w:spacing w:after="0"/>
-        <w:ind w:left="1134"/>
-        <w:rPr>
-          <w:color w:val="00B050"/>
-          <w:lang w:val="en-GB"/>
-        </w:rPr>
-      </w:pPr>
-      <w:r>
-        <w:rPr>
-          <w:color w:val="00B050"/>
-          <w:lang w:val="en-GB"/>
-        </w:rPr>
-        <w:t>application:</w:t>
-      </w:r>
-    </w:p>
-    <w:p>
-      <w:pPr>
-        <w:spacing w:after="0"/>
-        <w:ind w:left="1134"/>
-        <w:rPr>
-          <w:color w:val="00B050"/>
-          <w:lang w:val="en-GB"/>
-        </w:rPr>
-      </w:pPr>
-      <w:r>
-        <w:rPr>
-          <w:color w:val="00B050"/>
-          <w:lang w:val="en-GB"/>
-        </w:rPr>
-        <w:t xml:space="preserve">    name: </w:t>
-      </w:r>
-      <w:proofErr w:type="spellStart"/>
-      <w:r>
-        <w:rPr>
-          <w:color w:val="00B050"/>
-          <w:lang w:val="en-GB"/>
-        </w:rPr>
-        <w:t>OrderSync</w:t>
-      </w:r>
-      <w:proofErr w:type="spellEnd"/>
-    </w:p>
-    <w:p>
-      <w:pPr>
-        <w:spacing w:after="0"/>
-        <w:ind w:left="1134"/>
-        <w:rPr>
-          <w:color w:val="00B050"/>
-          <w:lang w:val="en-GB"/>
-        </w:rPr>
-      </w:pPr>
-      <w:r>
-        <w:rPr>
-          <w:color w:val="00B050"/>
-          <w:lang w:val="en-GB"/>
-        </w:rPr>
-        <w:t xml:space="preserve">    version: 1.0.0</w:t>
-      </w:r>
-    </w:p>
-    <w:p>
-      <w:pPr>
-        <w:spacing w:after="0"/>
-        <w:ind w:left="1134"/>
-        <w:rPr>
-          <w:color w:val="FF0000"/>
-          <w:lang w:val="en-GB"/>
-        </w:rPr>
-      </w:pPr>
-      <w:r>
-        <w:rPr>
-          <w:color w:val="00B050"/>
-          <w:lang w:val="en-GB"/>
-        </w:rPr>
-        <w:t xml:space="preserve">    </w:t>
-      </w:r>
-      <w:proofErr w:type="spellStart"/>
-      <w:r>
-        <w:rPr>
-          <w:color w:val="00B050"/>
-          <w:lang w:val="en-GB"/>
-        </w:rPr>
-        <w:t>log_directory</w:t>
-      </w:r>
-      <w:proofErr w:type="spellEnd"/>
-      <w:r>
-        <w:rPr>
-          <w:color w:val="FF0000"/>
-          <w:lang w:val="en-GB"/>
-        </w:rPr>
-        <w:t xml:space="preserve">: </w:t>
-      </w:r>
-      <w:r>
-        <w:rPr>
-          <w:color w:val="FF0000"/>
-          <w:lang w:val="en-GB"/>
-        </w:rPr>
-        <w:t>c:\winparf\logs</w:t>
-      </w:r>
-    </w:p>
-    <w:p>
-      <w:pPr>
-        <w:spacing w:after="0"/>
-        <w:ind w:left="1134"/>
-        <w:rPr>
-          <w:color w:val="FF0000"/>
-          <w:lang w:val="en-GB"/>
-        </w:rPr>
-      </w:pPr>
-      <w:r>
-        <w:rPr>
-          <w:color w:val="00B050"/>
-          <w:lang w:val="en-GB"/>
-        </w:rPr>
-        <w:t xml:space="preserve">    </w:t>
-      </w:r>
-      <w:proofErr w:type="spellStart"/>
-      <w:r>
-        <w:rPr>
-          <w:color w:val="00B050"/>
-          <w:lang w:val="en-GB"/>
-        </w:rPr>
-        <w:t>log_level</w:t>
-      </w:r>
-      <w:proofErr w:type="spellEnd"/>
-      <w:r>
-        <w:rPr>
-          <w:color w:val="00B050"/>
-          <w:lang w:val="en-GB"/>
-        </w:rPr>
-        <w:t xml:space="preserve">: </w:t>
-      </w:r>
-      <w:r>
-        <w:rPr>
-          <w:color w:val="FF0000"/>
-          <w:lang w:val="en-GB"/>
-        </w:rPr>
-        <w:t>INFO</w:t>
-      </w:r>
-    </w:p>
-    <w:p>
-      <w:pPr>
-        <w:spacing w:after="0"/>
-        <w:ind w:left="1134"/>
-        <w:rPr>
-          <w:color w:val="00B050"/>
-        </w:rPr>
-      </w:pPr>
-      <w:r>
-        <w:rPr>
-          <w:color w:val="00B050"/>
-        </w:rPr>
-        <w:t xml:space="preserve"># </w:t>
-      </w:r>
-      <w:proofErr w:type="spellStart"/>
-      <w:r>
-        <w:rPr>
-          <w:color w:val="00B050"/>
-        </w:rPr>
-        <w:t>int</w:t>
-      </w:r>
-      <w:proofErr w:type="spellEnd"/>
-      <w:r>
-        <w:rPr>
-          <w:color w:val="00B050"/>
-        </w:rPr>
-        <w:t xml:space="preserve"> en numéro de semaines. Fenêtre arrière pour mettre à jour les commandes dans COMMANDE et LGCDE. Absence, "0" ou négatif =&gt; fenêtre de filtrage désactivée.</w:t>
-      </w:r>
-    </w:p>
-    <w:p>
-      <w:pPr>
-        <w:spacing w:after="0"/>
-        <w:ind w:left="1134"/>
-        <w:rPr>
-          <w:b/>
-          <w:bCs/>
-          <w:color w:val="00B050"/>
-        </w:rPr>
-      </w:pPr>
-      <w:r>
-        <w:rPr>
-          <w:color w:val="00B050"/>
-        </w:rPr>
-        <w:t xml:space="preserve">    </w:t>
-      </w:r>
-      <w:proofErr w:type="spellStart"/>
-      <w:proofErr w:type="gramStart"/>
-      <w:r>
-        <w:rPr>
-          <w:color w:val="00B050"/>
-        </w:rPr>
-        <w:t>maj</w:t>
-      </w:r>
-      <w:proofErr w:type="gramEnd"/>
-      <w:r>
-        <w:rPr>
-          <w:color w:val="00B050"/>
-        </w:rPr>
-        <w:t>_periode</w:t>
-      </w:r>
-      <w:proofErr w:type="spellEnd"/>
-      <w:r>
-        <w:rPr>
-          <w:color w:val="00B050"/>
-        </w:rPr>
-        <w:t xml:space="preserve">: </w:t>
-      </w:r>
-      <w:r>
-        <w:rPr>
-          <w:b/>
-          <w:bCs/>
-          <w:color w:val="FF0000"/>
-        </w:rPr>
-        <w:t>30</w:t>
-      </w:r>
-    </w:p>
-    <w:p>
-      <w:pPr>
-        <w:spacing w:after="0"/>
-        <w:ind w:left="1134"/>
-        <w:rPr>
-          <w:color w:val="00B050"/>
-        </w:rPr>
-      </w:pPr>
-    </w:p>
-    <w:p>
-      <w:pPr>
-        <w:spacing w:after="0"/>
-        <w:ind w:left="1134"/>
-        <w:rPr>
-          <w:color w:val="00B050"/>
-        </w:rPr>
-      </w:pPr>
-      <w:proofErr w:type="spellStart"/>
-      <w:proofErr w:type="gramStart"/>
-      <w:r>
-        <w:rPr>
-          <w:color w:val="00B050"/>
-        </w:rPr>
-        <w:t>hyperfile</w:t>
-      </w:r>
-      <w:proofErr w:type="spellEnd"/>
-      <w:r>
-        <w:rPr>
-          <w:color w:val="00B050"/>
-        </w:rPr>
-        <w:t>:</w:t>
-      </w:r>
-      <w:proofErr w:type="gramEnd"/>
-    </w:p>
-    <w:p>
-      <w:pPr>
-        <w:spacing w:after="0"/>
-        <w:ind w:left="1134"/>
-        <w:rPr>
-          <w:color w:val="00B050"/>
-          <w:lang w:val="en-GB"/>
-        </w:rPr>
-      </w:pPr>
-      <w:r>
-        <w:rPr>
-          <w:color w:val="00B050"/>
-        </w:rPr>
-        <w:t xml:space="preserve">    </w:t>
-      </w:r>
-      <w:r>
-        <w:rPr>
-          <w:color w:val="00B050"/>
-          <w:lang w:val="en-GB"/>
-        </w:rPr>
-        <w:t>provider: PCSOFT.HFSQL</w:t>
-      </w:r>
-    </w:p>
-    <w:p>
-      <w:pPr>
-        <w:spacing w:after="0"/>
-        <w:ind w:left="1134"/>
-        <w:rPr>
-          <w:color w:val="00B050"/>
-          <w:lang w:val="en-GB"/>
-        </w:rPr>
-      </w:pPr>
-      <w:r>
-        <w:rPr>
-          <w:color w:val="00B050"/>
-          <w:lang w:val="en-GB"/>
-        </w:rPr>
-        <w:t xml:space="preserve">    repository: </w:t>
-      </w:r>
-      <w:r>
-        <w:rPr>
-          <w:color w:val="FF0000"/>
-          <w:lang w:val="en-GB"/>
-        </w:rPr>
-        <w:t>C:\winparf\data</w:t>
-      </w:r>
-    </w:p>
-    <w:p>
-      <w:pPr>
-        <w:spacing w:after="0"/>
-        <w:ind w:left="1134"/>
-        <w:rPr>
-          <w:color w:val="00B050"/>
-          <w:lang w:val="en-GB"/>
-        </w:rPr>
-      </w:pPr>
-      <w:r>
-        <w:rPr>
-          <w:color w:val="00B050"/>
-          <w:lang w:val="en-GB"/>
-        </w:rPr>
-        <w:lastRenderedPageBreak/>
-        <w:t xml:space="preserve">    password: WP2017NF525</w:t>
-      </w:r>
-    </w:p>
-    <w:p>
-      <w:pPr>
-        <w:spacing w:after="0"/>
-        <w:ind w:left="1134"/>
-        <w:rPr>
-          <w:color w:val="00B050"/>
-          <w:lang w:val="en-GB"/>
-        </w:rPr>
-      </w:pPr>
-    </w:p>
-    <w:p>
-      <w:pPr>
-        <w:spacing w:after="0"/>
-        <w:ind w:left="1134"/>
-        <w:rPr>
-          <w:color w:val="00B050"/>
-          <w:lang w:val="en-GB"/>
-        </w:rPr>
-      </w:pPr>
-      <w:proofErr w:type="spellStart"/>
-      <w:r>
-        <w:rPr>
-          <w:color w:val="00B050"/>
-          <w:lang w:val="en-GB"/>
-        </w:rPr>
-        <w:t>sqlserver</w:t>
-      </w:r>
-      <w:proofErr w:type="spellEnd"/>
-      <w:r>
-        <w:rPr>
-          <w:color w:val="00B050"/>
-          <w:lang w:val="en-GB"/>
-        </w:rPr>
-        <w:t>:</w:t>
-      </w:r>
-    </w:p>
-    <w:p>
-      <w:pPr>
-        <w:spacing w:after="0"/>
-        <w:ind w:left="1134"/>
-        <w:rPr>
-          <w:color w:val="00B050"/>
-          <w:lang w:val="en-GB"/>
-        </w:rPr>
-      </w:pPr>
-      <w:r>
-        <w:rPr>
-          <w:color w:val="00B050"/>
-          <w:lang w:val="en-GB"/>
-        </w:rPr>
-        <w:t xml:space="preserve">    driver: "</w:t>
-      </w:r>
-      <w:r>
-        <w:rPr>
-          <w:color w:val="FF0000"/>
-          <w:lang w:val="en-GB"/>
-        </w:rPr>
-        <w:t>ODBC Driver 18 for SQL Server</w:t>
-      </w:r>
-      <w:r>
-        <w:rPr>
-          <w:color w:val="00B050"/>
-          <w:lang w:val="en-GB"/>
-        </w:rPr>
-        <w:t>"</w:t>
-      </w:r>
-    </w:p>
-    <w:p>
-      <w:pPr>
-        <w:spacing w:after="0"/>
-        <w:ind w:left="1134"/>
-        <w:rPr>
-          <w:color w:val="00B050"/>
-          <w:lang w:val="en-GB"/>
-        </w:rPr>
-      </w:pPr>
-      <w:r>
-        <w:rPr>
-          <w:color w:val="00B050"/>
-          <w:lang w:val="en-GB"/>
-        </w:rPr>
-        <w:t xml:space="preserve">    server: </w:t>
-      </w:r>
-      <w:r>
-        <w:rPr>
-          <w:color w:val="FF0000"/>
-          <w:lang w:val="en-GB"/>
-        </w:rPr>
-        <w:t>W10\SQLEXPRESS</w:t>
-      </w:r>
-    </w:p>
-    <w:p>
-      <w:pPr>
-        <w:spacing w:after="0"/>
-        <w:ind w:left="1134"/>
-        <w:rPr>
-          <w:color w:val="00B050"/>
-          <w:lang w:val="en-GB"/>
-        </w:rPr>
-      </w:pPr>
-      <w:r>
-        <w:rPr>
-          <w:color w:val="00B050"/>
-          <w:lang w:val="en-GB"/>
-        </w:rPr>
-        <w:t xml:space="preserve">    database: </w:t>
-      </w:r>
-      <w:r>
-        <w:rPr>
-          <w:color w:val="FF0000"/>
-          <w:lang w:val="en-GB"/>
-        </w:rPr>
-        <w:t>WINPARF</w:t>
-      </w:r>
-    </w:p>
-    <w:p>
-      <w:pPr>
-        <w:spacing w:after="0"/>
-        <w:ind w:left="1134"/>
-        <w:rPr>
-          <w:color w:val="00B050"/>
-          <w:lang w:val="en-GB"/>
-        </w:rPr>
-      </w:pPr>
-      <w:r>
-        <w:rPr>
-          <w:color w:val="00B050"/>
-          <w:lang w:val="en-GB"/>
-        </w:rPr>
-        <w:t xml:space="preserve">    </w:t>
-      </w:r>
-      <w:proofErr w:type="spellStart"/>
-      <w:r>
-        <w:rPr>
-          <w:color w:val="00B050"/>
-          <w:lang w:val="en-GB"/>
-        </w:rPr>
-        <w:t>trusted_connection</w:t>
-      </w:r>
-      <w:proofErr w:type="spellEnd"/>
-      <w:r>
-        <w:rPr>
-          <w:color w:val="00B050"/>
-          <w:lang w:val="en-GB"/>
-        </w:rPr>
-        <w:t>: true</w:t>
-      </w:r>
-    </w:p>
-    <w:p>
-      <w:pPr>
-        <w:spacing w:after="0"/>
-        <w:ind w:left="1134"/>
-        <w:rPr>
-          <w:color w:val="00B050"/>
-          <w:lang w:val="en-GB"/>
-        </w:rPr>
-      </w:pPr>
-      <w:r>
-        <w:rPr>
-          <w:color w:val="00B050"/>
-          <w:lang w:val="en-GB"/>
-        </w:rPr>
-        <w:t xml:space="preserve">    username: </w:t>
-      </w:r>
-      <w:r>
-        <w:rPr>
-          <w:color w:val="FF0000"/>
-          <w:lang w:val="en-GB"/>
-        </w:rPr>
-        <w:t>""</w:t>
-      </w:r>
-    </w:p>
-    <w:p>
-      <w:pPr>
-        <w:spacing w:after="0"/>
-        <w:ind w:left="1134"/>
-        <w:rPr>
-          <w:color w:val="00B050"/>
-          <w:lang w:val="en-GB"/>
-        </w:rPr>
-      </w:pPr>
-      <w:r>
-        <w:rPr>
-          <w:color w:val="00B050"/>
-          <w:lang w:val="en-GB"/>
-        </w:rPr>
-        <w:t xml:space="preserve">    password: </w:t>
-      </w:r>
-      <w:r>
-        <w:rPr>
-          <w:color w:val="FF0000"/>
-          <w:lang w:val="en-GB"/>
-        </w:rPr>
-        <w:t>""</w:t>
-      </w:r>
-    </w:p>
-    <w:p>
-      <w:pPr>
-        <w:spacing w:after="0"/>
-        <w:ind w:left="1134"/>
-        <w:rPr>
-          <w:color w:val="00B050"/>
-          <w:lang w:val="en-GB"/>
-        </w:rPr>
-      </w:pPr>
-      <w:r>
-        <w:rPr>
-          <w:color w:val="00B050"/>
-          <w:lang w:val="en-GB"/>
-        </w:rPr>
-        <w:t xml:space="preserve">    timeout: 30</w:t>
-      </w:r>
-    </w:p>
-    <w:p>
-      <w:pPr>
-        <w:spacing w:after="0"/>
-        <w:ind w:left="1134"/>
-        <w:rPr>
-          <w:color w:val="00B050"/>
-          <w:lang w:val="en-GB"/>
-        </w:rPr>
-      </w:pPr>
-    </w:p>
-    <w:p>
-      <w:pPr>
-        <w:pStyle w:val="Heading2"/>
-      </w:pPr>
-      <w:bookmarkStart w:id="10" w:name="_Toc241166139"/>
-      <w:r>
-        <w:t xml:space="preserve">Activation des tables </w:t>
-      </w:r>
-      <w:proofErr w:type="spellStart"/>
-      <w:r>
-        <w:t>SQLServer</w:t>
-      </w:r>
-      <w:bookmarkEnd w:id="10"/>
-      <w:proofErr w:type="spellEnd"/>
-    </w:p>
-    <w:p>
-      <w:r>
-        <w:t xml:space="preserve">Pour créer les tables </w:t>
-      </w:r>
-      <w:r>
-        <w:rPr>
-          <w:b/>
-          <w:bCs/>
-        </w:rPr>
-        <w:t>COMMANDE</w:t>
-      </w:r>
-      <w:r>
-        <w:t xml:space="preserve"> et </w:t>
-      </w:r>
-      <w:r>
-        <w:rPr>
-          <w:b/>
-          <w:bCs/>
-        </w:rPr>
-        <w:t>LGCDE</w:t>
-      </w:r>
-      <w:r>
-        <w:t xml:space="preserve"> dans </w:t>
-      </w:r>
-      <w:proofErr w:type="spellStart"/>
-      <w:r>
-        <w:rPr>
-          <w:b/>
-          <w:bCs/>
-        </w:rPr>
-        <w:t>SQLServer</w:t>
-      </w:r>
-      <w:proofErr w:type="spellEnd"/>
-      <w:r>
-        <w:t xml:space="preserve"> vous lancez l’script </w:t>
-      </w:r>
-      <w:r>
-        <w:rPr>
-          <w:b/>
-          <w:bCs/>
-        </w:rPr>
-        <w:t>\</w:t>
-      </w:r>
-      <w:proofErr w:type="spellStart"/>
-      <w:r>
-        <w:rPr>
-          <w:b/>
-          <w:bCs/>
-        </w:rPr>
-        <w:t>OrderSync</w:t>
-      </w:r>
-      <w:proofErr w:type="spellEnd"/>
-      <w:r>
-        <w:rPr>
-          <w:b/>
-          <w:bCs/>
-        </w:rPr>
-        <w:t>\</w:t>
-      </w:r>
-      <w:proofErr w:type="spellStart"/>
-      <w:r>
-        <w:rPr>
-          <w:b/>
-          <w:bCs/>
-        </w:rPr>
-        <w:t>install</w:t>
-      </w:r>
-      <w:proofErr w:type="spellEnd"/>
-      <w:r>
-        <w:rPr>
-          <w:b/>
-          <w:bCs/>
-        </w:rPr>
-        <w:t>\activation_tables.bat</w:t>
-      </w:r>
-      <w:r>
-        <w:t xml:space="preserve">  </w:t>
-      </w:r>
-    </w:p>
-    <w:p>
-      <w:r>
-        <w:rPr>
-          <w:noProof/>
-        </w:rPr>
+    </w:p>
+    <w:p>
+      <w:pPr>
+        <w:pStyle w:val="ListParagraph"/>
+        <w:jc w:val="both"/>
+      </w:pPr>
+      <w:r>
         <w:drawing>
-          <wp:inline distT="0" distB="0" distL="0" distR="0" wp14:anchorId="78A7B6C3" wp14:editId="551B3ED7">
-            <wp:extent cx="2057687" cy="1743318"/>
-            <wp:effectExtent l="0" t="0" r="0" b="9525"/>
-            <wp:docPr id="1" name="Picture 1"/>
+          <wp:inline distT="0" distB="0" distL="0" distR="0" wp14:anchorId="7154F302" wp14:editId="51BFDCFE">
+            <wp:extent cx="4858149" cy="3332480"/>
+            <wp:effectExtent l="0" t="0" r="0" b="1270"/>
+            <wp:docPr id="7" name="Picture 7"/>
             <wp:cNvGraphicFramePr>
               <a:graphicFrameLocks xmlns:a="http://schemas.openxmlformats.org/drawingml/2006/main" noChangeAspect="1"/>
             </wp:cNvGraphicFramePr>
@@ -5668,7 +4924,7 @@
                   <pic:spPr>
                     <a:xfrm>
                       <a:off x="0" y="0"/>
-                      <a:ext cx="2057687" cy="1743318"/>
+                      <a:ext cx="4861419" cy="3334723"/>
                     </a:xfrm>
                     <a:prstGeom prst="rect">
                       <a:avLst/>
@@ -5682,27 +4938,779 @@
       </w:r>
     </w:p>
     <w:p>
-      <w:r>
-        <w:t>Vous pouvez toujours efface</w:t>
-      </w:r>
-      <w:r>
-        <w:t>r</w:t>
-      </w:r>
-      <w:r>
-        <w:t xml:space="preserve"> les tables dans </w:t>
+      <w:pPr>
+        <w:pStyle w:val="Heading2"/>
+      </w:pPr>
+      <w:bookmarkStart w:id="9" w:name="_Toc241166138"/>
+      <w:r>
+        <w:lastRenderedPageBreak/>
+        <w:t>Paramétrage de l'environnement</w:t>
+      </w:r>
+      <w:bookmarkEnd w:id="9"/>
+    </w:p>
+    <w:p>
+      <w:pPr>
+        <w:pStyle w:val="ListParagraph"/>
+        <w:numPr>
+          <w:ilvl w:val="0"/>
+          <w:numId w:val="11"/>
+        </w:numPr>
+        <w:rPr>
+          <w:i/>
+          <w:iCs/>
+          <w:color w:val="808080" w:themeColor="background1" w:themeShade="80"/>
+        </w:rPr>
+      </w:pPr>
+      <w:r>
+        <w:t xml:space="preserve">Fichier </w:t>
       </w:r>
       <w:proofErr w:type="spellStart"/>
       <w:r>
+        <w:rPr>
+          <w:b/>
+          <w:bCs/>
+        </w:rPr>
+        <w:t>OrderSync</w:t>
+      </w:r>
+      <w:proofErr w:type="spellEnd"/>
+      <w:r>
+        <w:rPr>
+          <w:b/>
+          <w:bCs/>
+        </w:rPr>
+        <w:t>\config\</w:t>
+      </w:r>
+      <w:proofErr w:type="spellStart"/>
+      <w:r>
+        <w:rPr>
+          <w:b/>
+          <w:bCs/>
+        </w:rPr>
+        <w:t>config.yaml</w:t>
+      </w:r>
+      <w:proofErr w:type="spellEnd"/>
+      <w:r>
+        <w:rPr>
+          <w:b/>
+          <w:bCs/>
+        </w:rPr>
+        <w:t>.</w:t>
+      </w:r>
+      <w:r>
+        <w:t xml:space="preserve"> Ce fichier </w:t>
+      </w:r>
+      <w:r>
+        <w:t>contient</w:t>
+      </w:r>
+      <w:r>
+        <w:t xml:space="preserve"> les principaux paramètres de </w:t>
+      </w:r>
+      <w:r>
+        <w:t>l’installation</w:t>
+      </w:r>
+      <w:r>
+        <w:t xml:space="preserve">. Il faudra l’éditer conformément à l’installation de </w:t>
+      </w:r>
+      <w:proofErr w:type="spellStart"/>
+      <w:r>
+        <w:t>winparf</w:t>
+      </w:r>
+      <w:proofErr w:type="spellEnd"/>
+      <w:r>
+        <w:rPr>
+          <w:color w:val="808080" w:themeColor="background1" w:themeShade="80"/>
+        </w:rPr>
+        <w:t>.</w:t>
+      </w:r>
+      <w:r>
+        <w:rPr>
+          <w:i/>
+          <w:iCs/>
+          <w:color w:val="808080" w:themeColor="background1" w:themeShade="80"/>
+        </w:rPr>
+        <w:t xml:space="preserve"> YAML est un langage qui </w:t>
+      </w:r>
+      <w:r>
+        <w:rPr>
+          <w:i/>
+          <w:iCs/>
+          <w:color w:val="808080" w:themeColor="background1" w:themeShade="80"/>
+        </w:rPr>
+        <w:t>défini</w:t>
+      </w:r>
+      <w:r>
+        <w:rPr>
+          <w:i/>
+          <w:iCs/>
+          <w:color w:val="808080" w:themeColor="background1" w:themeShade="80"/>
+        </w:rPr>
+        <w:t>t</w:t>
+      </w:r>
+      <w:r>
+        <w:rPr>
+          <w:i/>
+          <w:iCs/>
+          <w:color w:val="808080" w:themeColor="background1" w:themeShade="80"/>
+        </w:rPr>
+        <w:t xml:space="preserve"> les niveaux par indentation (un numéro de caractères blanc</w:t>
+      </w:r>
+      <w:r>
+        <w:rPr>
+          <w:i/>
+          <w:iCs/>
+          <w:color w:val="808080" w:themeColor="background1" w:themeShade="80"/>
+        </w:rPr>
+        <w:t>s</w:t>
+      </w:r>
+      <w:r>
+        <w:rPr>
+          <w:i/>
+          <w:iCs/>
+          <w:color w:val="808080" w:themeColor="background1" w:themeShade="80"/>
+        </w:rPr>
+        <w:t xml:space="preserve"> égal partout).</w:t>
+      </w:r>
+      <w:r>
+        <w:rPr>
+          <w:i/>
+          <w:iCs/>
+          <w:color w:val="808080" w:themeColor="background1" w:themeShade="80"/>
+        </w:rPr>
+        <w:t xml:space="preserve"> Le caractère # est pour commenter les lignes</w:t>
+      </w:r>
+    </w:p>
+    <w:p>
+      <w:pPr>
+        <w:spacing w:after="0"/>
+        <w:ind w:left="1134"/>
+        <w:rPr>
+          <w:color w:val="00B050"/>
+          <w:lang w:val="en-GB"/>
+        </w:rPr>
+      </w:pPr>
+      <w:r>
+        <w:rPr>
+          <w:color w:val="00B050"/>
+          <w:lang w:val="en-GB"/>
+        </w:rPr>
+        <w:t xml:space="preserve"># YAML file </w:t>
+      </w:r>
+      <w:proofErr w:type="gramStart"/>
+      <w:r>
+        <w:rPr>
+          <w:color w:val="00B050"/>
+          <w:lang w:val="en-GB"/>
+        </w:rPr>
+        <w:t>location :</w:t>
+      </w:r>
+      <w:proofErr w:type="gramEnd"/>
+      <w:r>
+        <w:rPr>
+          <w:color w:val="00B050"/>
+          <w:lang w:val="en-GB"/>
+        </w:rPr>
+        <w:t xml:space="preserve"> config/</w:t>
+      </w:r>
+    </w:p>
+    <w:p>
+      <w:pPr>
+        <w:spacing w:after="0"/>
+        <w:ind w:left="1134"/>
+        <w:rPr>
+          <w:color w:val="00B050"/>
+          <w:lang w:val="en-GB"/>
+        </w:rPr>
+      </w:pPr>
+      <w:r>
+        <w:rPr>
+          <w:color w:val="00B050"/>
+          <w:lang w:val="en-GB"/>
+        </w:rPr>
+        <w:t>application:</w:t>
+      </w:r>
+    </w:p>
+    <w:p>
+      <w:pPr>
+        <w:spacing w:after="0"/>
+        <w:ind w:left="1134"/>
+        <w:rPr>
+          <w:color w:val="00B050"/>
+          <w:lang w:val="en-GB"/>
+        </w:rPr>
+      </w:pPr>
+      <w:r>
+        <w:rPr>
+          <w:color w:val="00B050"/>
+          <w:lang w:val="en-GB"/>
+        </w:rPr>
+        <w:t xml:space="preserve">    name: </w:t>
+      </w:r>
+      <w:proofErr w:type="spellStart"/>
+      <w:r>
+        <w:rPr>
+          <w:color w:val="00B050"/>
+          <w:lang w:val="en-GB"/>
+        </w:rPr>
+        <w:t>OrderSync</w:t>
+      </w:r>
+      <w:proofErr w:type="spellEnd"/>
+    </w:p>
+    <w:p>
+      <w:pPr>
+        <w:spacing w:after="0"/>
+        <w:ind w:left="1134"/>
+        <w:rPr>
+          <w:color w:val="00B050"/>
+          <w:lang w:val="en-GB"/>
+        </w:rPr>
+      </w:pPr>
+      <w:r>
+        <w:rPr>
+          <w:color w:val="00B050"/>
+          <w:lang w:val="en-GB"/>
+        </w:rPr>
+        <w:t xml:space="preserve">    version: 1.0.0</w:t>
+      </w:r>
+    </w:p>
+    <w:p>
+      <w:pPr>
+        <w:spacing w:after="0"/>
+        <w:ind w:left="1134"/>
+        <w:rPr>
+          <w:color w:val="FF0000"/>
+          <w:lang w:val="en-GB"/>
+        </w:rPr>
+      </w:pPr>
+      <w:r>
+        <w:rPr>
+          <w:color w:val="00B050"/>
+          <w:lang w:val="en-GB"/>
+        </w:rPr>
+        <w:t xml:space="preserve">    </w:t>
+      </w:r>
+      <w:proofErr w:type="spellStart"/>
+      <w:r>
+        <w:rPr>
+          <w:color w:val="00B050"/>
+          <w:lang w:val="en-GB"/>
+        </w:rPr>
+        <w:t>log_directory</w:t>
+      </w:r>
+      <w:proofErr w:type="spellEnd"/>
+      <w:r>
+        <w:rPr>
+          <w:color w:val="FF0000"/>
+          <w:lang w:val="en-GB"/>
+        </w:rPr>
+        <w:t xml:space="preserve">: </w:t>
+      </w:r>
+      <w:r>
+        <w:rPr>
+          <w:color w:val="FF0000"/>
+          <w:lang w:val="en-GB"/>
+        </w:rPr>
+        <w:t>c:\winparf\logs</w:t>
+      </w:r>
+    </w:p>
+    <w:p>
+      <w:pPr>
+        <w:spacing w:after="0"/>
+        <w:ind w:left="1134"/>
+        <w:rPr>
+          <w:color w:val="FF0000"/>
+          <w:lang w:val="en-GB"/>
+        </w:rPr>
+      </w:pPr>
+      <w:r>
+        <w:rPr>
+          <w:color w:val="00B050"/>
+          <w:lang w:val="en-GB"/>
+        </w:rPr>
+        <w:t xml:space="preserve">    </w:t>
+      </w:r>
+      <w:proofErr w:type="spellStart"/>
+      <w:r>
+        <w:rPr>
+          <w:color w:val="00B050"/>
+          <w:lang w:val="en-GB"/>
+        </w:rPr>
+        <w:t>log_level</w:t>
+      </w:r>
+      <w:proofErr w:type="spellEnd"/>
+      <w:r>
+        <w:rPr>
+          <w:color w:val="00B050"/>
+          <w:lang w:val="en-GB"/>
+        </w:rPr>
+        <w:t xml:space="preserve">: </w:t>
+      </w:r>
+      <w:r>
+        <w:rPr>
+          <w:color w:val="FF0000"/>
+          <w:lang w:val="en-GB"/>
+        </w:rPr>
+        <w:t>INFO</w:t>
+      </w:r>
+    </w:p>
+    <w:p>
+      <w:pPr>
+        <w:spacing w:after="0"/>
+        <w:ind w:left="1134"/>
+        <w:rPr>
+          <w:color w:val="00B050"/>
+        </w:rPr>
+      </w:pPr>
+      <w:r>
+        <w:rPr>
+          <w:color w:val="00B050"/>
+        </w:rPr>
+        <w:t xml:space="preserve"># </w:t>
+      </w:r>
+      <w:proofErr w:type="spellStart"/>
+      <w:r>
+        <w:rPr>
+          <w:color w:val="00B050"/>
+        </w:rPr>
+        <w:t>int</w:t>
+      </w:r>
+      <w:proofErr w:type="spellEnd"/>
+      <w:r>
+        <w:rPr>
+          <w:color w:val="00B050"/>
+        </w:rPr>
+        <w:t xml:space="preserve"> en numéro de semaines. Fenêtre arrière pour mettre à jour les commandes dans COMMANDE et LGCDE. Absence, "0" ou négatif =&gt; fenêtre de filtrage désactivée.</w:t>
+      </w:r>
+    </w:p>
+    <w:p>
+      <w:pPr>
+        <w:spacing w:after="0"/>
+        <w:ind w:left="1134"/>
+        <w:rPr>
+          <w:b/>
+          <w:bCs/>
+          <w:color w:val="00B050"/>
+        </w:rPr>
+      </w:pPr>
+      <w:r>
+        <w:rPr>
+          <w:color w:val="00B050"/>
+        </w:rPr>
+        <w:t xml:space="preserve">    </w:t>
+      </w:r>
+      <w:proofErr w:type="spellStart"/>
+      <w:proofErr w:type="gramStart"/>
+      <w:r>
+        <w:rPr>
+          <w:color w:val="00B050"/>
+        </w:rPr>
+        <w:t>maj</w:t>
+      </w:r>
+      <w:proofErr w:type="gramEnd"/>
+      <w:r>
+        <w:rPr>
+          <w:color w:val="00B050"/>
+        </w:rPr>
+        <w:t>_periode</w:t>
+      </w:r>
+      <w:proofErr w:type="spellEnd"/>
+      <w:r>
+        <w:rPr>
+          <w:color w:val="00B050"/>
+        </w:rPr>
+        <w:t xml:space="preserve">: </w:t>
+      </w:r>
+      <w:r>
+        <w:rPr>
+          <w:b/>
+          <w:bCs/>
+          <w:color w:val="FF0000"/>
+        </w:rPr>
+        <w:t>30</w:t>
+      </w:r>
+    </w:p>
+    <w:p>
+      <w:pPr>
+        <w:spacing w:after="0"/>
+        <w:ind w:left="1134"/>
+        <w:rPr>
+          <w:color w:val="00B050"/>
+        </w:rPr>
+      </w:pPr>
+    </w:p>
+    <w:p>
+      <w:pPr>
+        <w:spacing w:after="0"/>
+        <w:ind w:left="1134"/>
+        <w:rPr>
+          <w:color w:val="00B050"/>
+        </w:rPr>
+      </w:pPr>
+      <w:proofErr w:type="spellStart"/>
+      <w:proofErr w:type="gramStart"/>
+      <w:r>
+        <w:rPr>
+          <w:color w:val="00B050"/>
+        </w:rPr>
+        <w:t>hyperfile</w:t>
+      </w:r>
+      <w:proofErr w:type="spellEnd"/>
+      <w:r>
+        <w:rPr>
+          <w:color w:val="00B050"/>
+        </w:rPr>
+        <w:t>:</w:t>
+      </w:r>
+      <w:proofErr w:type="gramEnd"/>
+    </w:p>
+    <w:p>
+      <w:pPr>
+        <w:spacing w:after="0"/>
+        <w:ind w:left="1134"/>
+        <w:rPr>
+          <w:color w:val="00B050"/>
+        </w:rPr>
+      </w:pPr>
+      <w:r>
+        <w:rPr>
+          <w:color w:val="00B050"/>
+        </w:rPr>
+        <w:t xml:space="preserve">    </w:t>
+      </w:r>
+      <w:proofErr w:type="gramStart"/>
+      <w:r>
+        <w:rPr>
+          <w:color w:val="00B050"/>
+        </w:rPr>
+        <w:t>provider:</w:t>
+      </w:r>
+      <w:proofErr w:type="gramEnd"/>
+      <w:r>
+        <w:rPr>
+          <w:color w:val="00B050"/>
+        </w:rPr>
+        <w:t xml:space="preserve"> PCSOFT.HFSQL</w:t>
+      </w:r>
+    </w:p>
+    <w:p>
+      <w:pPr>
+        <w:spacing w:after="0"/>
+        <w:ind w:left="1134"/>
+        <w:rPr>
+          <w:color w:val="00B050"/>
+          <w:lang w:val="en-GB"/>
+        </w:rPr>
+      </w:pPr>
+      <w:r>
+        <w:rPr>
+          <w:color w:val="00B050"/>
+        </w:rPr>
+        <w:t xml:space="preserve">    </w:t>
+      </w:r>
+      <w:r>
+        <w:rPr>
+          <w:color w:val="00B050"/>
+          <w:lang w:val="en-GB"/>
+        </w:rPr>
+        <w:t xml:space="preserve">repository: </w:t>
+      </w:r>
+      <w:r>
+        <w:rPr>
+          <w:color w:val="FF0000"/>
+          <w:lang w:val="en-GB"/>
+        </w:rPr>
+        <w:t>C:\winparf\data</w:t>
+      </w:r>
+    </w:p>
+    <w:p>
+      <w:pPr>
+        <w:spacing w:after="0"/>
+        <w:ind w:left="1134"/>
+        <w:rPr>
+          <w:color w:val="00B050"/>
+          <w:lang w:val="en-GB"/>
+        </w:rPr>
+      </w:pPr>
+      <w:r>
+        <w:rPr>
+          <w:color w:val="00B050"/>
+          <w:lang w:val="en-GB"/>
+        </w:rPr>
+        <w:t xml:space="preserve">    password: WP2017NF525</w:t>
+      </w:r>
+    </w:p>
+    <w:p>
+      <w:pPr>
+        <w:spacing w:after="0"/>
+        <w:ind w:left="1134"/>
+        <w:rPr>
+          <w:color w:val="00B050"/>
+          <w:lang w:val="en-GB"/>
+        </w:rPr>
+      </w:pPr>
+    </w:p>
+    <w:p>
+      <w:pPr>
+        <w:spacing w:after="0"/>
+        <w:ind w:left="1134"/>
+        <w:rPr>
+          <w:color w:val="00B050"/>
+          <w:lang w:val="en-GB"/>
+        </w:rPr>
+      </w:pPr>
+      <w:proofErr w:type="spellStart"/>
+      <w:r>
+        <w:rPr>
+          <w:color w:val="00B050"/>
+          <w:lang w:val="en-GB"/>
+        </w:rPr>
+        <w:t>sqlserver</w:t>
+      </w:r>
+      <w:proofErr w:type="spellEnd"/>
+      <w:r>
+        <w:rPr>
+          <w:color w:val="00B050"/>
+          <w:lang w:val="en-GB"/>
+        </w:rPr>
+        <w:t>:</w:t>
+      </w:r>
+    </w:p>
+    <w:p>
+      <w:pPr>
+        <w:spacing w:after="0"/>
+        <w:ind w:left="1134"/>
+        <w:rPr>
+          <w:color w:val="00B050"/>
+          <w:lang w:val="en-GB"/>
+        </w:rPr>
+      </w:pPr>
+      <w:r>
+        <w:rPr>
+          <w:color w:val="00B050"/>
+          <w:lang w:val="en-GB"/>
+        </w:rPr>
+        <w:t xml:space="preserve">    driver: "</w:t>
+      </w:r>
+      <w:r>
+        <w:rPr>
+          <w:color w:val="FF0000"/>
+          <w:lang w:val="en-GB"/>
+        </w:rPr>
+        <w:t>ODBC Driver 18 for SQL Server</w:t>
+      </w:r>
+      <w:r>
+        <w:rPr>
+          <w:color w:val="00B050"/>
+          <w:lang w:val="en-GB"/>
+        </w:rPr>
+        <w:t>"</w:t>
+      </w:r>
+    </w:p>
+    <w:p>
+      <w:pPr>
+        <w:spacing w:after="0"/>
+        <w:ind w:left="1134"/>
+        <w:rPr>
+          <w:color w:val="00B050"/>
+          <w:lang w:val="en-GB"/>
+        </w:rPr>
+      </w:pPr>
+      <w:r>
+        <w:rPr>
+          <w:color w:val="00B050"/>
+          <w:lang w:val="en-GB"/>
+        </w:rPr>
+        <w:t xml:space="preserve">    server: </w:t>
+      </w:r>
+      <w:r>
+        <w:rPr>
+          <w:color w:val="FF0000"/>
+          <w:lang w:val="en-GB"/>
+        </w:rPr>
+        <w:t>W10\SQLEXPRESS</w:t>
+      </w:r>
+    </w:p>
+    <w:p>
+      <w:pPr>
+        <w:spacing w:after="0"/>
+        <w:ind w:left="1134"/>
+        <w:rPr>
+          <w:color w:val="00B050"/>
+          <w:lang w:val="en-GB"/>
+        </w:rPr>
+      </w:pPr>
+      <w:r>
+        <w:rPr>
+          <w:color w:val="00B050"/>
+          <w:lang w:val="en-GB"/>
+        </w:rPr>
+        <w:t xml:space="preserve">    database: </w:t>
+      </w:r>
+      <w:r>
+        <w:rPr>
+          <w:color w:val="FF0000"/>
+          <w:lang w:val="en-GB"/>
+        </w:rPr>
+        <w:t>WINPARF</w:t>
+      </w:r>
+    </w:p>
+    <w:p>
+      <w:pPr>
+        <w:spacing w:after="0"/>
+        <w:ind w:left="1134"/>
+        <w:rPr>
+          <w:color w:val="00B050"/>
+          <w:lang w:val="en-GB"/>
+        </w:rPr>
+      </w:pPr>
+      <w:r>
+        <w:rPr>
+          <w:color w:val="00B050"/>
+          <w:lang w:val="en-GB"/>
+        </w:rPr>
+        <w:t xml:space="preserve">    </w:t>
+      </w:r>
+      <w:proofErr w:type="spellStart"/>
+      <w:r>
+        <w:rPr>
+          <w:color w:val="00B050"/>
+          <w:lang w:val="en-GB"/>
+        </w:rPr>
+        <w:t>trusted_connection</w:t>
+      </w:r>
+      <w:proofErr w:type="spellEnd"/>
+      <w:r>
+        <w:rPr>
+          <w:color w:val="00B050"/>
+          <w:lang w:val="en-GB"/>
+        </w:rPr>
+        <w:t>: true</w:t>
+      </w:r>
+    </w:p>
+    <w:p>
+      <w:pPr>
+        <w:spacing w:after="0"/>
+        <w:ind w:left="1134"/>
+        <w:rPr>
+          <w:color w:val="00B050"/>
+          <w:lang w:val="en-GB"/>
+        </w:rPr>
+      </w:pPr>
+      <w:r>
+        <w:rPr>
+          <w:color w:val="00B050"/>
+          <w:lang w:val="en-GB"/>
+        </w:rPr>
+        <w:t xml:space="preserve">    username: </w:t>
+      </w:r>
+      <w:r>
+        <w:rPr>
+          <w:color w:val="FF0000"/>
+          <w:lang w:val="en-GB"/>
+        </w:rPr>
+        <w:t>""</w:t>
+      </w:r>
+    </w:p>
+    <w:p>
+      <w:pPr>
+        <w:spacing w:after="0"/>
+        <w:ind w:left="1134"/>
+        <w:rPr>
+          <w:color w:val="00B050"/>
+          <w:lang w:val="en-GB"/>
+        </w:rPr>
+      </w:pPr>
+      <w:r>
+        <w:rPr>
+          <w:color w:val="00B050"/>
+          <w:lang w:val="en-GB"/>
+        </w:rPr>
+        <w:t xml:space="preserve">    password: </w:t>
+      </w:r>
+      <w:r>
+        <w:rPr>
+          <w:color w:val="FF0000"/>
+          <w:lang w:val="en-GB"/>
+        </w:rPr>
+        <w:t>""</w:t>
+      </w:r>
+    </w:p>
+    <w:p>
+      <w:pPr>
+        <w:spacing w:after="0"/>
+        <w:ind w:left="1134"/>
+        <w:rPr>
+          <w:color w:val="00B050"/>
+          <w:lang w:val="en-GB"/>
+        </w:rPr>
+      </w:pPr>
+      <w:r>
+        <w:rPr>
+          <w:color w:val="00B050"/>
+          <w:lang w:val="en-GB"/>
+        </w:rPr>
+        <w:t xml:space="preserve">    timeout: 30</w:t>
+      </w:r>
+    </w:p>
+    <w:p>
+      <w:pPr>
+        <w:spacing w:after="0"/>
+        <w:ind w:left="1134"/>
+        <w:rPr>
+          <w:color w:val="00B050"/>
+          <w:lang w:val="en-GB"/>
+        </w:rPr>
+      </w:pPr>
+    </w:p>
+    <w:p>
+      <w:pPr>
+        <w:pStyle w:val="Heading2"/>
+      </w:pPr>
+      <w:bookmarkStart w:id="10" w:name="_Toc241166139"/>
+      <w:r>
+        <w:t xml:space="preserve">Activation des tables </w:t>
+      </w:r>
+      <w:proofErr w:type="spellStart"/>
+      <w:r>
         <w:t>SQLServer</w:t>
       </w:r>
+      <w:bookmarkEnd w:id="10"/>
       <w:proofErr w:type="spellEnd"/>
-      <w:r>
-        <w:t xml:space="preserve"> et les créer à nouveau. </w:t>
-      </w:r>
-    </w:p>
-    <w:p>
-      <w:r>
-        <w:t xml:space="preserve">Dans </w:t>
+    </w:p>
+    <w:p>
+      <w:r>
+        <w:t xml:space="preserve">Pour créer les tables </w:t>
+      </w:r>
+      <w:r>
+        <w:rPr>
+          <w:b/>
+          <w:bCs/>
+        </w:rPr>
+        <w:t>COMMANDE</w:t>
+      </w:r>
+      <w:r>
+        <w:t xml:space="preserve"> et </w:t>
+      </w:r>
+      <w:r>
+        <w:rPr>
+          <w:b/>
+          <w:bCs/>
+        </w:rPr>
+        <w:t>LGCDE</w:t>
+      </w:r>
+      <w:r>
+        <w:t xml:space="preserve"> dans </w:t>
+      </w:r>
+      <w:proofErr w:type="spellStart"/>
+      <w:r>
+        <w:rPr>
+          <w:b/>
+          <w:bCs/>
+        </w:rPr>
+        <w:t>SQLServer</w:t>
+      </w:r>
+      <w:proofErr w:type="spellEnd"/>
+      <w:r>
+        <w:t xml:space="preserve"> vous lancez l’script </w:t>
       </w:r>
       <w:r>
         <w:rPr>
@@ -5733,7 +5741,7 @@
           <w:b/>
           <w:bCs/>
         </w:rPr>
-        <w:t>sql</w:t>
+        <w:t>install</w:t>
       </w:r>
       <w:proofErr w:type="spellEnd"/>
       <w:r>
@@ -5741,79 +5749,10 @@
           <w:b/>
           <w:bCs/>
         </w:rPr>
-        <w:t xml:space="preserve"> </w:t>
-      </w:r>
-      <w:r>
-        <w:t xml:space="preserve">vous trouverez les scripts </w:t>
-      </w:r>
-      <w:proofErr w:type="spellStart"/>
-      <w:r>
-        <w:t>sql</w:t>
-      </w:r>
-      <w:proofErr w:type="spellEnd"/>
-      <w:r>
-        <w:t xml:space="preserve"> </w:t>
-      </w:r>
-      <w:r>
-        <w:t>nécessaires</w:t>
-      </w:r>
-      <w:r>
-        <w:t xml:space="preserve"> pour </w:t>
-      </w:r>
-      <w:r>
-        <w:t xml:space="preserve">(1) </w:t>
-      </w:r>
-      <w:r>
-        <w:t>effacer</w:t>
-      </w:r>
-      <w:r>
-        <w:t xml:space="preserve"> et </w:t>
-      </w:r>
-      <w:r>
-        <w:t xml:space="preserve">(2) </w:t>
-      </w:r>
-      <w:r>
-        <w:t>supprimer</w:t>
-      </w:r>
-      <w:r>
-        <w:t xml:space="preserve"> les tables</w:t>
-      </w:r>
-      <w:r>
-        <w:t xml:space="preserve"> </w:t>
-      </w:r>
-      <w:r>
-        <w:t xml:space="preserve">et </w:t>
-      </w:r>
-      <w:r>
-        <w:t xml:space="preserve">les </w:t>
-      </w:r>
-      <w:r>
-        <w:t xml:space="preserve">(3) </w:t>
-      </w:r>
-      <w:r>
-        <w:t>créer</w:t>
-      </w:r>
-      <w:r>
-        <w:t xml:space="preserve"> à nouveau</w:t>
-      </w:r>
-      <w:r>
-        <w:t xml:space="preserve"> (depuis </w:t>
-      </w:r>
-      <w:proofErr w:type="spellStart"/>
-      <w:r>
-        <w:rPr>
-          <w:b/>
-          <w:bCs/>
-        </w:rPr>
-        <w:t>SQLServer</w:t>
-      </w:r>
-      <w:proofErr w:type="spellEnd"/>
-      <w:r>
-        <w:rPr>
-          <w:b/>
-          <w:bCs/>
-        </w:rPr>
-        <w:t>).</w:t>
+        <w:t>\activation_tables.bat</w:t>
+      </w:r>
+      <w:r>
+        <w:t xml:space="preserve">  </w:t>
       </w:r>
     </w:p>
     <w:p>
@@ -5822,10 +5761,10 @@
           <w:noProof/>
         </w:rPr>
         <w:drawing>
-          <wp:inline distT="0" distB="0" distL="0" distR="0" wp14:anchorId="052E8912" wp14:editId="654D1D27">
-            <wp:extent cx="2267266" cy="1038370"/>
+          <wp:inline distT="0" distB="0" distL="0" distR="0" wp14:anchorId="78A7B6C3" wp14:editId="551B3ED7">
+            <wp:extent cx="2057687" cy="1743318"/>
             <wp:effectExtent l="0" t="0" r="0" b="9525"/>
-            <wp:docPr id="5" name="Picture 5"/>
+            <wp:docPr id="1" name="Picture 1"/>
             <wp:cNvGraphicFramePr>
               <a:graphicFrameLocks xmlns:a="http://schemas.openxmlformats.org/drawingml/2006/main" noChangeAspect="1"/>
             </wp:cNvGraphicFramePr>
@@ -5845,7 +5784,7 @@
                   <pic:spPr>
                     <a:xfrm>
                       <a:off x="0" y="0"/>
-                      <a:ext cx="2267266" cy="1038370"/>
+                      <a:ext cx="2057687" cy="1743318"/>
                     </a:xfrm>
                     <a:prstGeom prst="rect">
                       <a:avLst/>
@@ -5859,30 +5798,38 @@
       </w:r>
     </w:p>
     <w:p>
-      <w:pPr>
-        <w:pStyle w:val="Heading2"/>
-      </w:pPr>
-      <w:bookmarkStart w:id="11" w:name="_Toc241166140"/>
-      <w:r>
-        <w:t xml:space="preserve">Lancement </w:t>
-      </w:r>
-      <w:r>
-        <w:t>des scripts</w:t>
-      </w:r>
-      <w:bookmarkEnd w:id="11"/>
-    </w:p>
-    <w:p>
-      <w:r>
-        <w:t>Vous alle</w:t>
-      </w:r>
-      <w:r>
-        <w:t>z</w:t>
-      </w:r>
-      <w:r>
-        <w:t xml:space="preserve"> trouver dans </w:t>
+      <w:r>
+        <w:lastRenderedPageBreak/>
+        <w:t>Vous pouvez toujours efface</w:t>
+      </w:r>
+      <w:r>
+        <w:t>r</w:t>
+      </w:r>
+      <w:r>
+        <w:t xml:space="preserve"> les tables dans </w:t>
       </w:r>
       <w:proofErr w:type="spellStart"/>
       <w:r>
+        <w:t>SQLServer</w:t>
+      </w:r>
+      <w:proofErr w:type="spellEnd"/>
+      <w:r>
+        <w:t xml:space="preserve"> et les créer à nouveau. </w:t>
+      </w:r>
+    </w:p>
+    <w:p>
+      <w:r>
+        <w:t xml:space="preserve">Dans </w:t>
+      </w:r>
+      <w:r>
+        <w:rPr>
+          <w:b/>
+          <w:bCs/>
+        </w:rPr>
+        <w:t>\</w:t>
+      </w:r>
+      <w:proofErr w:type="spellStart"/>
+      <w:r>
         <w:rPr>
           <w:b/>
           <w:bCs/>
@@ -5895,316 +5842,95 @@
           <w:b/>
           <w:bCs/>
         </w:rPr>
-        <w:t>\bat</w:t>
-      </w:r>
-      <w:r>
-        <w:t xml:space="preserve"> les différents fichiers bat pour lancer les scripts. Utilisez ces scripts comme modèle pour vos bat</w:t>
-      </w:r>
-      <w:r>
-        <w:t>s</w:t>
-      </w:r>
-      <w:r>
-        <w:t xml:space="preserve">. </w:t>
-      </w:r>
-    </w:p>
-    <w:p>
-      <w:pPr>
-        <w:pStyle w:val="ListParagraph"/>
-        <w:numPr>
-          <w:ilvl w:val="0"/>
-          <w:numId w:val="11"/>
-        </w:numPr>
-      </w:pPr>
-      <w:r>
-        <w:rPr>
-          <w:b/>
-          <w:bCs/>
-        </w:rPr>
-        <w:t>Creation_tables.bat</w:t>
-      </w:r>
-      <w:r>
-        <w:t xml:space="preserve">. Bat qui lance l’script </w:t>
-      </w:r>
-      <w:r>
-        <w:rPr>
-          <w:b/>
-          <w:bCs/>
-        </w:rPr>
-        <w:t>database_initializer.py</w:t>
-      </w:r>
-      <w:r>
-        <w:t xml:space="preserve"> proprement.</w:t>
-      </w:r>
-      <w:r>
-        <w:t xml:space="preserve"> (Regardez paragraphe 4.4)</w:t>
-      </w:r>
-    </w:p>
-    <w:p>
-      <w:pPr>
-        <w:pStyle w:val="ListParagraph"/>
-        <w:numPr>
-          <w:ilvl w:val="0"/>
-          <w:numId w:val="11"/>
-        </w:numPr>
-      </w:pPr>
+        <w:t>\</w:t>
+      </w:r>
       <w:proofErr w:type="spellStart"/>
-      <w:proofErr w:type="gramStart"/>
-      <w:r>
-        <w:rPr>
-          <w:b/>
-          <w:bCs/>
-        </w:rPr>
-        <w:t>maj</w:t>
-      </w:r>
-      <w:proofErr w:type="gramEnd"/>
-      <w:r>
-        <w:rPr>
-          <w:b/>
-          <w:bCs/>
-        </w:rPr>
-        <w:t>_SQL</w:t>
-      </w:r>
-      <w:r>
-        <w:t>bat</w:t>
+      <w:r>
+        <w:rPr>
+          <w:b/>
+          <w:bCs/>
+        </w:rPr>
+        <w:t>sql</w:t>
       </w:r>
       <w:proofErr w:type="spellEnd"/>
       <w:r>
-        <w:t xml:space="preserve">. Bat qui lance </w:t>
-      </w:r>
-      <w:r>
-        <w:rPr>
-          <w:b/>
-          <w:bCs/>
-        </w:rPr>
-        <w:t>main</w:t>
-      </w:r>
-      <w:r>
-        <w:rPr>
-          <w:b/>
-          <w:bCs/>
-        </w:rPr>
-        <w:t>.py</w:t>
-      </w:r>
-      <w:r>
-        <w:t xml:space="preserve"> proprement</w:t>
-      </w:r>
-    </w:p>
-    <w:p>
-      <w:pPr>
-        <w:pStyle w:val="ListParagraph"/>
-        <w:numPr>
-          <w:ilvl w:val="0"/>
-          <w:numId w:val="11"/>
-        </w:numPr>
-      </w:pPr>
-      <w:r>
-        <w:rPr>
-          <w:b/>
-          <w:bCs/>
-        </w:rPr>
-        <w:lastRenderedPageBreak/>
-        <w:t>Validation_commande.bat</w:t>
-      </w:r>
-      <w:r>
-        <w:t xml:space="preserve">. Bat qui lance l’script </w:t>
-      </w:r>
-      <w:r>
-        <w:rPr>
-          <w:b/>
-          <w:bCs/>
-        </w:rPr>
-        <w:t>validation_commande.py</w:t>
-      </w:r>
-      <w:r>
-        <w:t xml:space="preserve"> proprement.</w:t>
-      </w:r>
-    </w:p>
-    <w:p>
-      <w:pPr>
-        <w:pStyle w:val="ListParagraph"/>
-        <w:numPr>
-          <w:ilvl w:val="0"/>
-          <w:numId w:val="11"/>
-        </w:numPr>
-      </w:pPr>
-      <w:r>
-        <w:rPr>
-          <w:b/>
-          <w:bCs/>
-        </w:rPr>
-        <w:t>Validation_</w:t>
-      </w:r>
-      <w:r>
-        <w:rPr>
-          <w:b/>
-          <w:bCs/>
-        </w:rPr>
-        <w:t>lgcde</w:t>
-      </w:r>
-      <w:r>
-        <w:rPr>
-          <w:b/>
-          <w:bCs/>
-        </w:rPr>
-        <w:t>.bat</w:t>
-      </w:r>
-      <w:r>
-        <w:t xml:space="preserve">. Bat qui lance l’script </w:t>
-      </w:r>
-      <w:r>
-        <w:rPr>
-          <w:b/>
-          <w:bCs/>
-        </w:rPr>
-        <w:t>validation_</w:t>
-      </w:r>
-      <w:r>
-        <w:rPr>
-          <w:b/>
-          <w:bCs/>
-        </w:rPr>
-        <w:t>lgcde</w:t>
-      </w:r>
-      <w:r>
-        <w:rPr>
-          <w:b/>
-          <w:bCs/>
-        </w:rPr>
-        <w:t>.py</w:t>
-      </w:r>
-      <w:r>
-        <w:t xml:space="preserve"> proprement.</w:t>
-      </w:r>
-    </w:p>
-    <w:p>
-      <w:proofErr w:type="gramStart"/>
-      <w:r>
-        <w:t>et</w:t>
-      </w:r>
-      <w:proofErr w:type="gramEnd"/>
-    </w:p>
-    <w:p>
-      <w:pPr>
-        <w:pStyle w:val="ListParagraph"/>
-        <w:numPr>
-          <w:ilvl w:val="0"/>
-          <w:numId w:val="11"/>
-        </w:numPr>
-      </w:pPr>
-      <w:r>
-        <w:rPr>
-          <w:b/>
-          <w:bCs/>
-        </w:rPr>
-        <w:t>Ordersync.bat</w:t>
-      </w:r>
-      <w:r>
-        <w:t xml:space="preserve"> Bat qui lance l’ensemble </w:t>
-      </w:r>
-      <w:r>
-        <w:rPr>
-          <w:b/>
-          <w:bCs/>
-        </w:rPr>
-        <w:t>main</w:t>
-      </w:r>
-      <w:r>
-        <w:rPr>
-          <w:b/>
-          <w:bCs/>
-        </w:rPr>
-        <w:t>.py</w:t>
-      </w:r>
-      <w:r>
-        <w:rPr>
-          <w:b/>
-          <w:bCs/>
-        </w:rPr>
-        <w:t xml:space="preserve">, </w:t>
-      </w:r>
-      <w:r>
-        <w:rPr>
-          <w:b/>
-          <w:bCs/>
-        </w:rPr>
-        <w:t>validation_commande.py</w:t>
-      </w:r>
-      <w:r>
         <w:rPr>
           <w:b/>
           <w:bCs/>
         </w:rPr>
         <w:t xml:space="preserve"> </w:t>
       </w:r>
-      <w:proofErr w:type="gramStart"/>
-      <w:r>
-        <w:t>et</w:t>
-      </w:r>
-      <w:r>
-        <w:rPr>
-          <w:b/>
-          <w:bCs/>
-        </w:rPr>
+      <w:r>
+        <w:t xml:space="preserve">vous trouverez les scripts </w:t>
+      </w:r>
+      <w:proofErr w:type="spellStart"/>
+      <w:r>
+        <w:t>sql</w:t>
+      </w:r>
+      <w:proofErr w:type="spellEnd"/>
+      <w:r>
         <w:t xml:space="preserve"> </w:t>
       </w:r>
       <w:r>
+        <w:t>nécessaires</w:t>
+      </w:r>
+      <w:r>
+        <w:t xml:space="preserve"> pour </w:t>
+      </w:r>
+      <w:r>
+        <w:t xml:space="preserve">(1) </w:t>
+      </w:r>
+      <w:r>
+        <w:t>effacer</w:t>
+      </w:r>
+      <w:r>
+        <w:t xml:space="preserve"> et </w:t>
+      </w:r>
+      <w:r>
+        <w:t xml:space="preserve">(2) </w:t>
+      </w:r>
+      <w:r>
+        <w:t>supprimer</w:t>
+      </w:r>
+      <w:r>
+        <w:t xml:space="preserve"> les tables</w:t>
+      </w:r>
+      <w:r>
         <w:t xml:space="preserve"> </w:t>
       </w:r>
       <w:r>
-        <w:rPr>
-          <w:b/>
-          <w:bCs/>
-        </w:rPr>
-        <w:t>validation_</w:t>
-      </w:r>
-      <w:r>
-        <w:rPr>
-          <w:b/>
-          <w:bCs/>
-        </w:rPr>
-        <w:t>lgcde</w:t>
-      </w:r>
-      <w:r>
-        <w:rPr>
-          <w:b/>
-          <w:bCs/>
-        </w:rPr>
-        <w:t>.py</w:t>
-      </w:r>
-      <w:proofErr w:type="gramEnd"/>
-      <w:r>
-        <w:t xml:space="preserve">  proprement et en séquence</w:t>
-      </w:r>
-      <w:r>
-        <w:t>.</w:t>
-      </w:r>
-    </w:p>
-    <w:p>
-      <w:r>
-        <w:t xml:space="preserve">Il est conseillé de lancer </w:t>
-      </w:r>
-      <w:r>
-        <w:t xml:space="preserve">ou intégrer </w:t>
-      </w:r>
-      <w:r>
-        <w:rPr>
-          <w:b/>
-          <w:bCs/>
-        </w:rPr>
-        <w:t>OrderSync</w:t>
-      </w:r>
-      <w:r>
-        <w:rPr>
-          <w:b/>
-          <w:bCs/>
-        </w:rPr>
-        <w:t>.bat</w:t>
-      </w:r>
-      <w:r>
-        <w:t xml:space="preserve"> </w:t>
-      </w:r>
-      <w:r>
-        <w:t>à la fin du lancement quotidien de WPREPLIC dans le planificateur de tâches.</w:t>
+        <w:t xml:space="preserve">et </w:t>
+      </w:r>
+      <w:r>
+        <w:t xml:space="preserve">les </w:t>
+      </w:r>
+      <w:r>
+        <w:t xml:space="preserve">(3) </w:t>
+      </w:r>
+      <w:r>
+        <w:t>créer</w:t>
+      </w:r>
+      <w:r>
+        <w:t xml:space="preserve"> à nouveau</w:t>
+      </w:r>
+      <w:r>
+        <w:t xml:space="preserve"> (depuis </w:t>
+      </w:r>
+      <w:proofErr w:type="spellStart"/>
+      <w:r>
+        <w:rPr>
+          <w:b/>
+          <w:bCs/>
+        </w:rPr>
+        <w:t>SQLServer</w:t>
+      </w:r>
+      <w:proofErr w:type="spellEnd"/>
+      <w:r>
+        <w:rPr>
+          <w:b/>
+          <w:bCs/>
+        </w:rPr>
+        <w:t>).</w:t>
       </w:r>
     </w:p>
     <w:p>
@@ -6213,10 +5939,10 @@
           <w:noProof/>
         </w:rPr>
         <w:drawing>
-          <wp:inline distT="0" distB="0" distL="0" distR="0" wp14:anchorId="00DC474B" wp14:editId="108337D7">
-            <wp:extent cx="5760720" cy="1926590"/>
-            <wp:effectExtent l="0" t="0" r="0" b="0"/>
-            <wp:docPr id="15" name="Picture 15"/>
+          <wp:inline distT="0" distB="0" distL="0" distR="0" wp14:anchorId="052E8912" wp14:editId="654D1D27">
+            <wp:extent cx="2267266" cy="1038370"/>
+            <wp:effectExtent l="0" t="0" r="0" b="9525"/>
+            <wp:docPr id="5" name="Picture 5"/>
             <wp:cNvGraphicFramePr>
               <a:graphicFrameLocks xmlns:a="http://schemas.openxmlformats.org/drawingml/2006/main" noChangeAspect="1"/>
             </wp:cNvGraphicFramePr>
@@ -6236,6 +5962,396 @@
                   <pic:spPr>
                     <a:xfrm>
                       <a:off x="0" y="0"/>
+                      <a:ext cx="2267266" cy="1038370"/>
+                    </a:xfrm>
+                    <a:prstGeom prst="rect">
+                      <a:avLst/>
+                    </a:prstGeom>
+                  </pic:spPr>
+                </pic:pic>
+              </a:graphicData>
+            </a:graphic>
+          </wp:inline>
+        </w:drawing>
+      </w:r>
+    </w:p>
+    <w:p>
+      <w:pPr>
+        <w:pStyle w:val="Heading2"/>
+      </w:pPr>
+      <w:bookmarkStart w:id="11" w:name="_Toc241166140"/>
+      <w:r>
+        <w:t xml:space="preserve">Lancement </w:t>
+      </w:r>
+      <w:r>
+        <w:t>des scripts</w:t>
+      </w:r>
+      <w:bookmarkEnd w:id="11"/>
+    </w:p>
+    <w:p>
+      <w:r>
+        <w:t>Vous alle</w:t>
+      </w:r>
+      <w:r>
+        <w:t>z</w:t>
+      </w:r>
+      <w:r>
+        <w:t xml:space="preserve"> trouver dans </w:t>
+      </w:r>
+      <w:proofErr w:type="spellStart"/>
+      <w:r>
+        <w:rPr>
+          <w:b/>
+          <w:bCs/>
+        </w:rPr>
+        <w:t>OrderSync</w:t>
+      </w:r>
+      <w:proofErr w:type="spellEnd"/>
+      <w:r>
+        <w:rPr>
+          <w:b/>
+          <w:bCs/>
+        </w:rPr>
+        <w:t>\bat</w:t>
+      </w:r>
+      <w:r>
+        <w:t xml:space="preserve"> les différents fichiers bat pour lancer les scripts. Utilisez ces scripts comme modèle pour vos bat</w:t>
+      </w:r>
+      <w:r>
+        <w:t>s</w:t>
+      </w:r>
+      <w:r>
+        <w:t xml:space="preserve">. </w:t>
+      </w:r>
+    </w:p>
+    <w:p>
+      <w:pPr>
+        <w:pStyle w:val="ListParagraph"/>
+        <w:numPr>
+          <w:ilvl w:val="0"/>
+          <w:numId w:val="11"/>
+        </w:numPr>
+      </w:pPr>
+      <w:r>
+        <w:rPr>
+          <w:b/>
+          <w:bCs/>
+        </w:rPr>
+        <w:t>Creation_tables.bat</w:t>
+      </w:r>
+      <w:r>
+        <w:t xml:space="preserve">. Bat qui lance l’script </w:t>
+      </w:r>
+      <w:r>
+        <w:rPr>
+          <w:b/>
+          <w:bCs/>
+        </w:rPr>
+        <w:t>database_initializer.py</w:t>
+      </w:r>
+      <w:r>
+        <w:t xml:space="preserve"> proprement.</w:t>
+      </w:r>
+      <w:r>
+        <w:t xml:space="preserve"> (Regardez paragraphe 4.4)</w:t>
+      </w:r>
+    </w:p>
+    <w:p>
+      <w:pPr>
+        <w:pStyle w:val="ListParagraph"/>
+        <w:numPr>
+          <w:ilvl w:val="0"/>
+          <w:numId w:val="11"/>
+        </w:numPr>
+      </w:pPr>
+      <w:proofErr w:type="spellStart"/>
+      <w:proofErr w:type="gramStart"/>
+      <w:r>
+        <w:rPr>
+          <w:b/>
+          <w:bCs/>
+        </w:rPr>
+        <w:t>maj</w:t>
+      </w:r>
+      <w:proofErr w:type="gramEnd"/>
+      <w:r>
+        <w:rPr>
+          <w:b/>
+          <w:bCs/>
+        </w:rPr>
+        <w:t>_SQL</w:t>
+      </w:r>
+      <w:r>
+        <w:t>bat</w:t>
+      </w:r>
+      <w:proofErr w:type="spellEnd"/>
+      <w:r>
+        <w:t xml:space="preserve">. Bat qui lance </w:t>
+      </w:r>
+      <w:r>
+        <w:rPr>
+          <w:b/>
+          <w:bCs/>
+        </w:rPr>
+        <w:t>main</w:t>
+      </w:r>
+      <w:r>
+        <w:rPr>
+          <w:b/>
+          <w:bCs/>
+        </w:rPr>
+        <w:t>.py</w:t>
+      </w:r>
+      <w:r>
+        <w:t xml:space="preserve"> proprement</w:t>
+      </w:r>
+    </w:p>
+    <w:p>
+      <w:pPr>
+        <w:pStyle w:val="ListParagraph"/>
+        <w:numPr>
+          <w:ilvl w:val="0"/>
+          <w:numId w:val="11"/>
+        </w:numPr>
+      </w:pPr>
+      <w:r>
+        <w:rPr>
+          <w:b/>
+          <w:bCs/>
+        </w:rPr>
+        <w:t>Validation_commande.bat</w:t>
+      </w:r>
+      <w:r>
+        <w:t xml:space="preserve">. Bat qui lance l’script </w:t>
+      </w:r>
+      <w:r>
+        <w:rPr>
+          <w:b/>
+          <w:bCs/>
+        </w:rPr>
+        <w:t>validation_commande.py</w:t>
+      </w:r>
+      <w:r>
+        <w:t xml:space="preserve"> proprement.</w:t>
+      </w:r>
+    </w:p>
+    <w:p>
+      <w:pPr>
+        <w:pStyle w:val="ListParagraph"/>
+        <w:numPr>
+          <w:ilvl w:val="0"/>
+          <w:numId w:val="11"/>
+        </w:numPr>
+      </w:pPr>
+      <w:r>
+        <w:rPr>
+          <w:b/>
+          <w:bCs/>
+        </w:rPr>
+        <w:t>Validation_</w:t>
+      </w:r>
+      <w:r>
+        <w:rPr>
+          <w:b/>
+          <w:bCs/>
+        </w:rPr>
+        <w:t>lgcde</w:t>
+      </w:r>
+      <w:r>
+        <w:rPr>
+          <w:b/>
+          <w:bCs/>
+        </w:rPr>
+        <w:t>.bat</w:t>
+      </w:r>
+      <w:r>
+        <w:t xml:space="preserve">. Bat qui lance l’script </w:t>
+      </w:r>
+      <w:r>
+        <w:rPr>
+          <w:b/>
+          <w:bCs/>
+        </w:rPr>
+        <w:t>validation_</w:t>
+      </w:r>
+      <w:r>
+        <w:rPr>
+          <w:b/>
+          <w:bCs/>
+        </w:rPr>
+        <w:t>lgcde</w:t>
+      </w:r>
+      <w:r>
+        <w:rPr>
+          <w:b/>
+          <w:bCs/>
+        </w:rPr>
+        <w:t>.py</w:t>
+      </w:r>
+      <w:r>
+        <w:t xml:space="preserve"> proprement.</w:t>
+      </w:r>
+    </w:p>
+    <w:p>
+      <w:proofErr w:type="gramStart"/>
+      <w:r>
+        <w:t>et</w:t>
+      </w:r>
+      <w:proofErr w:type="gramEnd"/>
+    </w:p>
+    <w:p>
+      <w:pPr>
+        <w:pStyle w:val="ListParagraph"/>
+        <w:numPr>
+          <w:ilvl w:val="0"/>
+          <w:numId w:val="11"/>
+        </w:numPr>
+      </w:pPr>
+      <w:r>
+        <w:rPr>
+          <w:b/>
+          <w:bCs/>
+        </w:rPr>
+        <w:t>Ordersync.bat</w:t>
+      </w:r>
+      <w:r>
+        <w:t xml:space="preserve"> Bat qui lance l’ensemble </w:t>
+      </w:r>
+      <w:r>
+        <w:rPr>
+          <w:b/>
+          <w:bCs/>
+        </w:rPr>
+        <w:t>main</w:t>
+      </w:r>
+      <w:r>
+        <w:rPr>
+          <w:b/>
+          <w:bCs/>
+        </w:rPr>
+        <w:t>.py</w:t>
+      </w:r>
+      <w:r>
+        <w:rPr>
+          <w:b/>
+          <w:bCs/>
+        </w:rPr>
+        <w:t xml:space="preserve">, </w:t>
+      </w:r>
+      <w:r>
+        <w:rPr>
+          <w:b/>
+          <w:bCs/>
+        </w:rPr>
+        <w:t>validation_commande.py</w:t>
+      </w:r>
+      <w:r>
+        <w:rPr>
+          <w:b/>
+          <w:bCs/>
+        </w:rPr>
+        <w:t xml:space="preserve"> </w:t>
+      </w:r>
+      <w:proofErr w:type="gramStart"/>
+      <w:r>
+        <w:t>et</w:t>
+      </w:r>
+      <w:r>
+        <w:rPr>
+          <w:b/>
+          <w:bCs/>
+        </w:rPr>
+        <w:t xml:space="preserve"> </w:t>
+      </w:r>
+      <w:r>
+        <w:t xml:space="preserve"> </w:t>
+      </w:r>
+      <w:r>
+        <w:rPr>
+          <w:b/>
+          <w:bCs/>
+        </w:rPr>
+        <w:t>validation_</w:t>
+      </w:r>
+      <w:r>
+        <w:rPr>
+          <w:b/>
+          <w:bCs/>
+        </w:rPr>
+        <w:t>lgcde</w:t>
+      </w:r>
+      <w:r>
+        <w:rPr>
+          <w:b/>
+          <w:bCs/>
+        </w:rPr>
+        <w:t>.py</w:t>
+      </w:r>
+      <w:proofErr w:type="gramEnd"/>
+      <w:r>
+        <w:t xml:space="preserve">  proprement et en séquence</w:t>
+      </w:r>
+      <w:r>
+        <w:t>.</w:t>
+      </w:r>
+    </w:p>
+    <w:p>
+      <w:r>
+        <w:t xml:space="preserve">Il est conseillé de lancer </w:t>
+      </w:r>
+      <w:r>
+        <w:t xml:space="preserve">ou intégrer </w:t>
+      </w:r>
+      <w:r>
+        <w:rPr>
+          <w:b/>
+          <w:bCs/>
+        </w:rPr>
+        <w:t>OrderSync</w:t>
+      </w:r>
+      <w:r>
+        <w:rPr>
+          <w:b/>
+          <w:bCs/>
+        </w:rPr>
+        <w:t>.bat</w:t>
+      </w:r>
+      <w:r>
+        <w:t xml:space="preserve"> </w:t>
+      </w:r>
+      <w:r>
+        <w:t>à la fin du lancement quotidien de WPREPLIC dans le planificateur de tâches.</w:t>
+      </w:r>
+    </w:p>
+    <w:p>
+      <w:r>
+        <w:rPr>
+          <w:noProof/>
+        </w:rPr>
+        <w:drawing>
+          <wp:inline distT="0" distB="0" distL="0" distR="0" wp14:anchorId="00DC474B" wp14:editId="108337D7">
+            <wp:extent cx="5760720" cy="1926590"/>
+            <wp:effectExtent l="0" t="0" r="0" b="0"/>
+            <wp:docPr id="15" name="Picture 15"/>
+            <wp:cNvGraphicFramePr>
+              <a:graphicFrameLocks xmlns:a="http://schemas.openxmlformats.org/drawingml/2006/main" noChangeAspect="1"/>
+            </wp:cNvGraphicFramePr>
+            <a:graphic xmlns:a="http://schemas.openxmlformats.org/drawingml/2006/main">
+              <a:graphicData uri="http://schemas.openxmlformats.org/drawingml/2006/picture">
+                <pic:pic xmlns:pic="http://schemas.openxmlformats.org/drawingml/2006/picture">
+                  <pic:nvPicPr>
+                    <pic:cNvPr id="1" name=""/>
+                    <pic:cNvPicPr/>
+                  </pic:nvPicPr>
+                  <pic:blipFill>
+                    <a:blip r:embed="rId17"/>
+                    <a:stretch>
+                      <a:fillRect/>
+                    </a:stretch>
+                  </pic:blipFill>
+                  <pic:spPr>
+                    <a:xfrm>
+                      <a:off x="0" y="0"/>
                       <a:ext cx="5760720" cy="1926590"/>
                     </a:xfrm>
                     <a:prstGeom prst="rect">
@@ -6355,6 +6471,7 @@
           <w:b/>
           <w:bCs/>
         </w:rPr>
+        <w:lastRenderedPageBreak/>
         <w:t>o</w:t>
       </w:r>
       <w:r>
@@ -6488,9 +6605,9 @@
       </w:r>
     </w:p>
     <w:sectPr>
-      <w:headerReference w:type="default" r:id="rId17"/>
-      <w:footerReference w:type="default" r:id="rId18"/>
-      <w:footerReference w:type="first" r:id="rId19"/>
+      <w:headerReference w:type="default" r:id="rId18"/>
+      <w:footerReference w:type="default" r:id="rId19"/>
+      <w:footerReference w:type="first" r:id="rId20"/>
       <w:pgSz w:w="11906" w:h="16838"/>
       <w:pgMar w:top="1417" w:right="1417" w:bottom="1417" w:left="1417" w:header="283" w:footer="0" w:gutter="0"/>
       <w:cols w:space="708"/>
@@ -10325,6 +10442,7 @@
   <w:rsids>
     <w:rsidRoot w:val="00BE21DA"/>
     <w:rsid w:val="00040F1A"/>
+    <w:rsid w:val="00060F0F"/>
     <w:rsid w:val="000C4B5D"/>
     <w:rsid w:val="000F03D7"/>
     <w:rsid w:val="001120E3"/>

</xml_diff>